<commit_message>
Remove access script and update CV files
Delete generate_access_config.py and add it to .gitignore. Remove old Budai_Bence_CV.docx, rename Bence_Budai_CV_EN.docx to Budai_Bence_CV_EN.docx, and update Budai_Bence_CV_HU.docx (binary change).
</commit_message>
<xml_diff>
--- a/Budai_Bence_CV_HU.docx
+++ b/Budai_Bence_CV_HU.docx
@@ -58,7 +58,7 @@
                 <w:noProof/>
               </w:rPr>
               <w:drawing>
-                <wp:inline distT="0" distB="0" distL="0" distR="0" wp14:anchorId="114BCF41" wp14:editId="245A9D59">
+                <wp:inline distT="0" distB="0" distL="0" distR="0" wp14:anchorId="1F336FB4" wp14:editId="13511A2C">
                   <wp:extent cx="1238250" cy="1238250"/>
                   <wp:effectExtent l="0" t="0" r="0" b="0"/>
                   <wp:docPr id="1" name="Picture 1"/>
@@ -211,25 +211,32 @@
             <w:pPr>
               <w:spacing w:before="100" w:after="200"/>
             </w:pPr>
-            <w:proofErr w:type="gramStart"/>
-            <w:r>
-              <w:rPr>
-                <w:rFonts w:ascii="Calibri" w:eastAsia="Calibri" w:hAnsi="Calibri" w:cs="Calibri"/>
-                <w:color w:val="555555"/>
-                <w:sz w:val="19"/>
-                <w:szCs w:val="19"/>
-              </w:rPr>
-              <w:t>Angol  B</w:t>
-            </w:r>
-            <w:proofErr w:type="gramEnd"/>
-            <w:r>
-              <w:rPr>
-                <w:rFonts w:ascii="Calibri" w:eastAsia="Calibri" w:hAnsi="Calibri" w:cs="Calibri"/>
-                <w:color w:val="555555"/>
-                <w:sz w:val="19"/>
-                <w:szCs w:val="19"/>
-              </w:rPr>
-              <w:t>2</w:t>
+            <w:r>
+              <w:rPr>
+                <w:rFonts w:ascii="Calibri" w:eastAsia="Calibri" w:hAnsi="Calibri" w:cs="Calibri"/>
+                <w:color w:val="555555"/>
+                <w:sz w:val="19"/>
+                <w:szCs w:val="19"/>
+              </w:rPr>
+              <w:t>Angol – B2</w:t>
+            </w:r>
+            <w:r>
+              <w:rPr>
+                <w:rFonts w:ascii="Calibri" w:eastAsia="Calibri" w:hAnsi="Calibri" w:cs="Calibri"/>
+                <w:color w:val="555555"/>
+                <w:sz w:val="19"/>
+                <w:szCs w:val="19"/>
+              </w:rPr>
+              <w:br/>
+            </w:r>
+            <w:r>
+              <w:rPr>
+                <w:rFonts w:ascii="Calibri" w:eastAsia="Calibri" w:hAnsi="Calibri" w:cs="Calibri"/>
+                <w:color w:val="555555"/>
+                <w:sz w:val="19"/>
+                <w:szCs w:val="19"/>
+              </w:rPr>
+              <w:t>Magyar – anyanyelvi</w:t>
             </w:r>
           </w:p>
           <w:p>
@@ -743,7 +750,79 @@
                 <w:sz w:val="18"/>
                 <w:szCs w:val="18"/>
               </w:rPr>
-              <w:t>.</w:t>
+              <w:t xml:space="preserve">. Több </w:t>
+            </w:r>
+            <w:proofErr w:type="spellStart"/>
+            <w:r>
+              <w:rPr>
+                <w:rFonts w:ascii="Calibri" w:eastAsia="Calibri" w:hAnsi="Calibri" w:cs="Calibri"/>
+                <w:color w:val="555555"/>
+                <w:sz w:val="18"/>
+                <w:szCs w:val="18"/>
+              </w:rPr>
+              <w:t>ASP.NET</w:t>
+            </w:r>
+            <w:proofErr w:type="spellEnd"/>
+            <w:r>
+              <w:rPr>
+                <w:rFonts w:ascii="Calibri" w:eastAsia="Calibri" w:hAnsi="Calibri" w:cs="Calibri"/>
+                <w:color w:val="555555"/>
+                <w:sz w:val="18"/>
+                <w:szCs w:val="18"/>
+              </w:rPr>
+              <w:t xml:space="preserve"> </w:t>
+            </w:r>
+            <w:proofErr w:type="spellStart"/>
+            <w:r>
+              <w:rPr>
+                <w:rFonts w:ascii="Calibri" w:eastAsia="Calibri" w:hAnsi="Calibri" w:cs="Calibri"/>
+                <w:color w:val="555555"/>
+                <w:sz w:val="18"/>
+                <w:szCs w:val="18"/>
+              </w:rPr>
+              <w:t>Core</w:t>
+            </w:r>
+            <w:proofErr w:type="spellEnd"/>
+            <w:r>
+              <w:rPr>
+                <w:rFonts w:ascii="Calibri" w:eastAsia="Calibri" w:hAnsi="Calibri" w:cs="Calibri"/>
+                <w:color w:val="555555"/>
+                <w:sz w:val="18"/>
+                <w:szCs w:val="18"/>
+              </w:rPr>
+              <w:t xml:space="preserve"> projekt fut egyszerre, mindegyik saját fejlesztésű.</w:t>
+            </w:r>
+          </w:p>
+          <w:p>
+            <w:pPr>
+              <w:spacing w:before="100" w:after="20"/>
+            </w:pPr>
+            <w:r>
+              <w:rPr>
+                <w:rFonts w:ascii="Calibri" w:eastAsia="Calibri" w:hAnsi="Calibri" w:cs="Calibri"/>
+                <w:b/>
+                <w:bCs/>
+                <w:color w:val="1A1A2E"/>
+              </w:rPr>
+              <w:t>Fotózás és</w:t>
+            </w:r>
+            <w:r>
+              <w:rPr>
+                <w:rFonts w:ascii="Calibri" w:eastAsia="Calibri" w:hAnsi="Calibri" w:cs="Calibri"/>
+                <w:color w:val="555555"/>
+                <w:sz w:val="18"/>
+                <w:szCs w:val="18"/>
+              </w:rPr>
+              <w:t xml:space="preserve"> </w:t>
+            </w:r>
+            <w:r>
+              <w:rPr>
+                <w:rFonts w:ascii="Calibri" w:eastAsia="Calibri" w:hAnsi="Calibri" w:cs="Calibri"/>
+                <w:b/>
+                <w:bCs/>
+                <w:color w:val="1A1A2E"/>
+              </w:rPr>
+              <w:t>kerékpározás</w:t>
             </w:r>
           </w:p>
         </w:tc>
@@ -807,117 +886,242 @@
           </w:p>
           <w:p>
             <w:pPr>
+              <w:spacing w:after="120"/>
+            </w:pPr>
+            <w:r>
+              <w:rPr>
+                <w:rFonts w:ascii="Calibri" w:eastAsia="Calibri" w:hAnsi="Calibri" w:cs="Calibri"/>
+                <w:color w:val="555555"/>
+                <w:sz w:val="19"/>
+                <w:szCs w:val="19"/>
+              </w:rPr>
+              <w:t xml:space="preserve">Junior szoftverfejlesztő és -tesztelő vagyok, tapasztalattal </w:t>
+            </w:r>
+            <w:proofErr w:type="spellStart"/>
+            <w:r>
+              <w:rPr>
+                <w:rFonts w:ascii="Calibri" w:eastAsia="Calibri" w:hAnsi="Calibri" w:cs="Calibri"/>
+                <w:color w:val="555555"/>
+                <w:sz w:val="19"/>
+                <w:szCs w:val="19"/>
+              </w:rPr>
+              <w:t>ASP.NET</w:t>
+            </w:r>
+            <w:proofErr w:type="spellEnd"/>
+            <w:r>
+              <w:rPr>
+                <w:rFonts w:ascii="Calibri" w:eastAsia="Calibri" w:hAnsi="Calibri" w:cs="Calibri"/>
+                <w:color w:val="555555"/>
+                <w:sz w:val="19"/>
+                <w:szCs w:val="19"/>
+              </w:rPr>
+              <w:t xml:space="preserve"> </w:t>
+            </w:r>
+            <w:proofErr w:type="spellStart"/>
+            <w:r>
+              <w:rPr>
+                <w:rFonts w:ascii="Calibri" w:eastAsia="Calibri" w:hAnsi="Calibri" w:cs="Calibri"/>
+                <w:color w:val="555555"/>
+                <w:sz w:val="19"/>
+                <w:szCs w:val="19"/>
+              </w:rPr>
+              <w:t>Core</w:t>
+            </w:r>
+            <w:proofErr w:type="spellEnd"/>
+            <w:r>
+              <w:rPr>
+                <w:rFonts w:ascii="Calibri" w:eastAsia="Calibri" w:hAnsi="Calibri" w:cs="Calibri"/>
+                <w:color w:val="555555"/>
+                <w:sz w:val="19"/>
+                <w:szCs w:val="19"/>
+              </w:rPr>
+              <w:t xml:space="preserve"> web- és </w:t>
+            </w:r>
+            <w:proofErr w:type="spellStart"/>
+            <w:r>
+              <w:rPr>
+                <w:rFonts w:ascii="Calibri" w:eastAsia="Calibri" w:hAnsi="Calibri" w:cs="Calibri"/>
+                <w:color w:val="555555"/>
+                <w:sz w:val="19"/>
+                <w:szCs w:val="19"/>
+              </w:rPr>
+              <w:t>API</w:t>
+            </w:r>
+            <w:proofErr w:type="spellEnd"/>
+            <w:r>
+              <w:rPr>
+                <w:rFonts w:ascii="Calibri" w:eastAsia="Calibri" w:hAnsi="Calibri" w:cs="Calibri"/>
+                <w:color w:val="555555"/>
+                <w:sz w:val="19"/>
+                <w:szCs w:val="19"/>
+              </w:rPr>
+              <w:t xml:space="preserve">-fejlesztésben, SQL Server adatbázis-kezelésben és </w:t>
+            </w:r>
+            <w:proofErr w:type="spellStart"/>
+            <w:r>
+              <w:rPr>
+                <w:rFonts w:ascii="Calibri" w:eastAsia="Calibri" w:hAnsi="Calibri" w:cs="Calibri"/>
+                <w:color w:val="555555"/>
+                <w:sz w:val="19"/>
+                <w:szCs w:val="19"/>
+              </w:rPr>
+              <w:t>IIS</w:t>
+            </w:r>
+            <w:proofErr w:type="spellEnd"/>
+            <w:r>
+              <w:rPr>
+                <w:rFonts w:ascii="Calibri" w:eastAsia="Calibri" w:hAnsi="Calibri" w:cs="Calibri"/>
+                <w:color w:val="555555"/>
+                <w:sz w:val="19"/>
+                <w:szCs w:val="19"/>
+              </w:rPr>
+              <w:t xml:space="preserve"> üzemeltetésben. Saját </w:t>
+            </w:r>
+            <w:proofErr w:type="spellStart"/>
+            <w:r>
+              <w:rPr>
+                <w:rFonts w:ascii="Calibri" w:eastAsia="Calibri" w:hAnsi="Calibri" w:cs="Calibri"/>
+                <w:color w:val="555555"/>
+                <w:sz w:val="19"/>
+                <w:szCs w:val="19"/>
+              </w:rPr>
+              <w:t>homelab</w:t>
+            </w:r>
+            <w:proofErr w:type="spellEnd"/>
+            <w:r>
+              <w:rPr>
+                <w:rFonts w:ascii="Calibri" w:eastAsia="Calibri" w:hAnsi="Calibri" w:cs="Calibri"/>
+                <w:color w:val="555555"/>
+                <w:sz w:val="19"/>
+                <w:szCs w:val="19"/>
+              </w:rPr>
+              <w:t xml:space="preserve"> infrastruktúrát üzemeltetek Windows Serveren — Docker, </w:t>
+            </w:r>
+            <w:proofErr w:type="spellStart"/>
+            <w:r>
+              <w:rPr>
+                <w:rFonts w:ascii="Calibri" w:eastAsia="Calibri" w:hAnsi="Calibri" w:cs="Calibri"/>
+                <w:color w:val="555555"/>
+                <w:sz w:val="19"/>
+                <w:szCs w:val="19"/>
+              </w:rPr>
+              <w:t>Tailscale</w:t>
+            </w:r>
+            <w:proofErr w:type="spellEnd"/>
+            <w:r>
+              <w:rPr>
+                <w:rFonts w:ascii="Calibri" w:eastAsia="Calibri" w:hAnsi="Calibri" w:cs="Calibri"/>
+                <w:color w:val="555555"/>
+                <w:sz w:val="19"/>
+                <w:szCs w:val="19"/>
+              </w:rPr>
+              <w:t>, Pi-</w:t>
+            </w:r>
+            <w:proofErr w:type="spellStart"/>
+            <w:r>
+              <w:rPr>
+                <w:rFonts w:ascii="Calibri" w:eastAsia="Calibri" w:hAnsi="Calibri" w:cs="Calibri"/>
+                <w:color w:val="555555"/>
+                <w:sz w:val="19"/>
+                <w:szCs w:val="19"/>
+              </w:rPr>
+              <w:t>hole</w:t>
+            </w:r>
+            <w:proofErr w:type="spellEnd"/>
+            <w:r>
+              <w:rPr>
+                <w:rFonts w:ascii="Calibri" w:eastAsia="Calibri" w:hAnsi="Calibri" w:cs="Calibri"/>
+                <w:color w:val="555555"/>
+                <w:sz w:val="19"/>
+                <w:szCs w:val="19"/>
+              </w:rPr>
+              <w:t xml:space="preserve"> </w:t>
+            </w:r>
+            <w:proofErr w:type="spellStart"/>
+            <w:r>
+              <w:rPr>
+                <w:rFonts w:ascii="Calibri" w:eastAsia="Calibri" w:hAnsi="Calibri" w:cs="Calibri"/>
+                <w:color w:val="555555"/>
+                <w:sz w:val="19"/>
+                <w:szCs w:val="19"/>
+              </w:rPr>
+              <w:t>stack</w:t>
+            </w:r>
+            <w:proofErr w:type="spellEnd"/>
+            <w:r>
+              <w:rPr>
+                <w:rFonts w:ascii="Calibri" w:eastAsia="Calibri" w:hAnsi="Calibri" w:cs="Calibri"/>
+                <w:color w:val="555555"/>
+                <w:sz w:val="19"/>
+                <w:szCs w:val="19"/>
+              </w:rPr>
+              <w:t xml:space="preserve">. Jelenleg az Óbudai Egyetem </w:t>
+            </w:r>
+            <w:proofErr w:type="spellStart"/>
+            <w:r>
+              <w:rPr>
+                <w:rFonts w:ascii="Calibri" w:eastAsia="Calibri" w:hAnsi="Calibri" w:cs="Calibri"/>
+                <w:color w:val="555555"/>
+                <w:sz w:val="19"/>
+                <w:szCs w:val="19"/>
+              </w:rPr>
+              <w:t>NIK</w:t>
+            </w:r>
+            <w:proofErr w:type="spellEnd"/>
+            <w:r>
+              <w:rPr>
+                <w:rFonts w:ascii="Calibri" w:eastAsia="Calibri" w:hAnsi="Calibri" w:cs="Calibri"/>
+                <w:color w:val="555555"/>
+                <w:sz w:val="19"/>
+                <w:szCs w:val="19"/>
+              </w:rPr>
+              <w:t xml:space="preserve"> </w:t>
+            </w:r>
+            <w:proofErr w:type="spellStart"/>
+            <w:r>
+              <w:rPr>
+                <w:rFonts w:ascii="Calibri" w:eastAsia="Calibri" w:hAnsi="Calibri" w:cs="Calibri"/>
+                <w:color w:val="555555"/>
+                <w:sz w:val="19"/>
+                <w:szCs w:val="19"/>
+              </w:rPr>
+              <w:t>karán</w:t>
+            </w:r>
+            <w:proofErr w:type="spellEnd"/>
+            <w:r>
+              <w:rPr>
+                <w:rFonts w:ascii="Calibri" w:eastAsia="Calibri" w:hAnsi="Calibri" w:cs="Calibri"/>
+                <w:color w:val="555555"/>
+                <w:sz w:val="19"/>
+                <w:szCs w:val="19"/>
+              </w:rPr>
+              <w:t xml:space="preserve"> tanulok.</w:t>
+            </w:r>
+          </w:p>
+          <w:p>
+            <w:pPr>
               <w:spacing w:after="300"/>
             </w:pPr>
             <w:r>
               <w:rPr>
                 <w:rFonts w:ascii="Calibri" w:eastAsia="Calibri" w:hAnsi="Calibri" w:cs="Calibri"/>
-                <w:color w:val="555555"/>
-                <w:sz w:val="19"/>
-                <w:szCs w:val="19"/>
-              </w:rPr>
-              <w:t xml:space="preserve">Junior szoftverfejlesztő és -tesztelő vagyok, tapasztalattal adatbázistervezésben. Jártas vagyok </w:t>
-            </w:r>
-            <w:proofErr w:type="spellStart"/>
-            <w:r>
-              <w:rPr>
-                <w:rFonts w:ascii="Calibri" w:eastAsia="Calibri" w:hAnsi="Calibri" w:cs="Calibri"/>
-                <w:color w:val="555555"/>
-                <w:sz w:val="19"/>
-                <w:szCs w:val="19"/>
-              </w:rPr>
-              <w:t>Node.js</w:t>
-            </w:r>
-            <w:proofErr w:type="spellEnd"/>
-            <w:r>
-              <w:rPr>
-                <w:rFonts w:ascii="Calibri" w:eastAsia="Calibri" w:hAnsi="Calibri" w:cs="Calibri"/>
-                <w:color w:val="555555"/>
-                <w:sz w:val="19"/>
-                <w:szCs w:val="19"/>
-              </w:rPr>
-              <w:t xml:space="preserve">, SQL és </w:t>
-            </w:r>
-            <w:proofErr w:type="spellStart"/>
-            <w:r>
-              <w:rPr>
-                <w:rFonts w:ascii="Calibri" w:eastAsia="Calibri" w:hAnsi="Calibri" w:cs="Calibri"/>
-                <w:color w:val="555555"/>
-                <w:sz w:val="19"/>
-                <w:szCs w:val="19"/>
-              </w:rPr>
-              <w:t>Git</w:t>
-            </w:r>
-            <w:proofErr w:type="spellEnd"/>
-            <w:r>
-              <w:rPr>
-                <w:rFonts w:ascii="Calibri" w:eastAsia="Calibri" w:hAnsi="Calibri" w:cs="Calibri"/>
-                <w:color w:val="555555"/>
-                <w:sz w:val="19"/>
-                <w:szCs w:val="19"/>
-              </w:rPr>
-              <w:t xml:space="preserve"> rendszerekben. Magabiztosan használom a C#, HTML, </w:t>
-            </w:r>
-            <w:proofErr w:type="spellStart"/>
-            <w:r>
-              <w:rPr>
-                <w:rFonts w:ascii="Calibri" w:eastAsia="Calibri" w:hAnsi="Calibri" w:cs="Calibri"/>
-                <w:color w:val="555555"/>
-                <w:sz w:val="19"/>
-                <w:szCs w:val="19"/>
-              </w:rPr>
-              <w:t>CSS</w:t>
-            </w:r>
-            <w:proofErr w:type="spellEnd"/>
-            <w:r>
-              <w:rPr>
-                <w:rFonts w:ascii="Calibri" w:eastAsia="Calibri" w:hAnsi="Calibri" w:cs="Calibri"/>
-                <w:color w:val="555555"/>
-                <w:sz w:val="19"/>
-                <w:szCs w:val="19"/>
-              </w:rPr>
-              <w:t xml:space="preserve"> és JavaScript nyelveket. Jelenleg az Óbudai Egyetem </w:t>
-            </w:r>
-            <w:proofErr w:type="spellStart"/>
-            <w:r>
-              <w:rPr>
-                <w:rFonts w:ascii="Calibri" w:eastAsia="Calibri" w:hAnsi="Calibri" w:cs="Calibri"/>
-                <w:color w:val="555555"/>
-                <w:sz w:val="19"/>
-                <w:szCs w:val="19"/>
-              </w:rPr>
-              <w:t>NIK</w:t>
-            </w:r>
-            <w:proofErr w:type="spellEnd"/>
-            <w:r>
-              <w:rPr>
-                <w:rFonts w:ascii="Calibri" w:eastAsia="Calibri" w:hAnsi="Calibri" w:cs="Calibri"/>
-                <w:color w:val="555555"/>
-                <w:sz w:val="19"/>
-                <w:szCs w:val="19"/>
-              </w:rPr>
-              <w:t xml:space="preserve"> </w:t>
-            </w:r>
-            <w:proofErr w:type="spellStart"/>
-            <w:r>
-              <w:rPr>
-                <w:rFonts w:ascii="Calibri" w:eastAsia="Calibri" w:hAnsi="Calibri" w:cs="Calibri"/>
-                <w:color w:val="555555"/>
-                <w:sz w:val="19"/>
-                <w:szCs w:val="19"/>
-              </w:rPr>
-              <w:t>karán</w:t>
-            </w:r>
-            <w:proofErr w:type="spellEnd"/>
-            <w:r>
-              <w:rPr>
-                <w:rFonts w:ascii="Calibri" w:eastAsia="Calibri" w:hAnsi="Calibri" w:cs="Calibri"/>
-                <w:color w:val="555555"/>
-                <w:sz w:val="19"/>
-                <w:szCs w:val="19"/>
-              </w:rPr>
-              <w:t xml:space="preserve"> folytatom tanulmányaimat.</w:t>
-            </w:r>
+                <w:color w:val="888888"/>
+                <w:sz w:val="18"/>
+                <w:szCs w:val="18"/>
+              </w:rPr>
+              <w:t xml:space="preserve">Online portfólió: </w:t>
+            </w:r>
+            <w:proofErr w:type="spellStart"/>
+            <w:r>
+              <w:rPr>
+                <w:rFonts w:ascii="Calibri" w:eastAsia="Calibri" w:hAnsi="Calibri" w:cs="Calibri"/>
+                <w:color w:val="2563EB"/>
+                <w:sz w:val="18"/>
+                <w:szCs w:val="18"/>
+              </w:rPr>
+              <w:t>itsmebencebudai.github.io</w:t>
+            </w:r>
+            <w:proofErr w:type="spellEnd"/>
           </w:p>
           <w:p>
             <w:pPr>
@@ -1074,7 +1278,47 @@
                 <w:sz w:val="19"/>
                 <w:szCs w:val="19"/>
               </w:rPr>
-              <w:t xml:space="preserve"> fejlesztés</w:t>
+              <w:t xml:space="preserve"> fejlesztés, </w:t>
+            </w:r>
+            <w:proofErr w:type="spellStart"/>
+            <w:r>
+              <w:rPr>
+                <w:rFonts w:ascii="Calibri" w:eastAsia="Calibri" w:hAnsi="Calibri" w:cs="Calibri"/>
+                <w:color w:val="555555"/>
+                <w:sz w:val="19"/>
+                <w:szCs w:val="19"/>
+              </w:rPr>
+              <w:t>Razor</w:t>
+            </w:r>
+            <w:proofErr w:type="spellEnd"/>
+            <w:r>
+              <w:rPr>
+                <w:rFonts w:ascii="Calibri" w:eastAsia="Calibri" w:hAnsi="Calibri" w:cs="Calibri"/>
+                <w:color w:val="555555"/>
+                <w:sz w:val="19"/>
+                <w:szCs w:val="19"/>
+              </w:rPr>
+              <w:t xml:space="preserve"> </w:t>
+            </w:r>
+            <w:proofErr w:type="spellStart"/>
+            <w:r>
+              <w:rPr>
+                <w:rFonts w:ascii="Calibri" w:eastAsia="Calibri" w:hAnsi="Calibri" w:cs="Calibri"/>
+                <w:color w:val="555555"/>
+                <w:sz w:val="19"/>
+                <w:szCs w:val="19"/>
+              </w:rPr>
+              <w:t>Pages</w:t>
+            </w:r>
+            <w:proofErr w:type="spellEnd"/>
+            <w:r>
+              <w:rPr>
+                <w:rFonts w:ascii="Calibri" w:eastAsia="Calibri" w:hAnsi="Calibri" w:cs="Calibri"/>
+                <w:color w:val="555555"/>
+                <w:sz w:val="19"/>
+                <w:szCs w:val="19"/>
+              </w:rPr>
+              <w:t xml:space="preserve"> frontenddel</w:t>
             </w:r>
           </w:p>
           <w:p>
@@ -1093,8 +1337,39 @@
                 <w:sz w:val="19"/>
                 <w:szCs w:val="19"/>
               </w:rPr>
-              <w:t>SQL Server adatbázis-kezelés</w:t>
-            </w:r>
+              <w:t xml:space="preserve">SQL Server adatbázis-tervezés és -kezelés, </w:t>
+            </w:r>
+            <w:proofErr w:type="spellStart"/>
+            <w:r>
+              <w:rPr>
+                <w:rFonts w:ascii="Calibri" w:eastAsia="Calibri" w:hAnsi="Calibri" w:cs="Calibri"/>
+                <w:color w:val="555555"/>
+                <w:sz w:val="19"/>
+                <w:szCs w:val="19"/>
+              </w:rPr>
+              <w:t>Entity</w:t>
+            </w:r>
+            <w:proofErr w:type="spellEnd"/>
+            <w:r>
+              <w:rPr>
+                <w:rFonts w:ascii="Calibri" w:eastAsia="Calibri" w:hAnsi="Calibri" w:cs="Calibri"/>
+                <w:color w:val="555555"/>
+                <w:sz w:val="19"/>
+                <w:szCs w:val="19"/>
+              </w:rPr>
+              <w:t xml:space="preserve"> Framework </w:t>
+            </w:r>
+            <w:proofErr w:type="spellStart"/>
+            <w:r>
+              <w:rPr>
+                <w:rFonts w:ascii="Calibri" w:eastAsia="Calibri" w:hAnsi="Calibri" w:cs="Calibri"/>
+                <w:color w:val="555555"/>
+                <w:sz w:val="19"/>
+                <w:szCs w:val="19"/>
+              </w:rPr>
+              <w:t>Core</w:t>
+            </w:r>
+            <w:proofErr w:type="spellEnd"/>
           </w:p>
           <w:p>
             <w:pPr>
@@ -1123,7 +1398,47 @@
                 <w:sz w:val="19"/>
                 <w:szCs w:val="19"/>
               </w:rPr>
-              <w:t xml:space="preserve"> üzemeltetés és webszerver-karbantartás</w:t>
+              <w:t xml:space="preserve"> üzemeltetés, </w:t>
+            </w:r>
+            <w:proofErr w:type="spellStart"/>
+            <w:r>
+              <w:rPr>
+                <w:rFonts w:ascii="Calibri" w:eastAsia="Calibri" w:hAnsi="Calibri" w:cs="Calibri"/>
+                <w:color w:val="555555"/>
+                <w:sz w:val="19"/>
+                <w:szCs w:val="19"/>
+              </w:rPr>
+              <w:t>ARR</w:t>
+            </w:r>
+            <w:proofErr w:type="spellEnd"/>
+            <w:r>
+              <w:rPr>
+                <w:rFonts w:ascii="Calibri" w:eastAsia="Calibri" w:hAnsi="Calibri" w:cs="Calibri"/>
+                <w:color w:val="555555"/>
+                <w:sz w:val="19"/>
+                <w:szCs w:val="19"/>
+              </w:rPr>
+              <w:t xml:space="preserve"> </w:t>
+            </w:r>
+            <w:proofErr w:type="spellStart"/>
+            <w:r>
+              <w:rPr>
+                <w:rFonts w:ascii="Calibri" w:eastAsia="Calibri" w:hAnsi="Calibri" w:cs="Calibri"/>
+                <w:color w:val="555555"/>
+                <w:sz w:val="19"/>
+                <w:szCs w:val="19"/>
+              </w:rPr>
+              <w:t>reverse</w:t>
+            </w:r>
+            <w:proofErr w:type="spellEnd"/>
+            <w:r>
+              <w:rPr>
+                <w:rFonts w:ascii="Calibri" w:eastAsia="Calibri" w:hAnsi="Calibri" w:cs="Calibri"/>
+                <w:color w:val="555555"/>
+                <w:sz w:val="19"/>
+                <w:szCs w:val="19"/>
+              </w:rPr>
+              <w:t xml:space="preserve"> proxy konfiguráció</w:t>
             </w:r>
           </w:p>
           <w:p>
@@ -1142,7 +1457,7 @@
                 <w:sz w:val="19"/>
                 <w:szCs w:val="19"/>
               </w:rPr>
-              <w:t>Webalkalmazások karbantartása</w:t>
+              <w:t>Belső webalkalmazások fejlesztése és karbantartása</w:t>
             </w:r>
           </w:p>
           <w:p>
@@ -1172,7 +1487,518 @@
                 <w:sz w:val="19"/>
                 <w:szCs w:val="19"/>
               </w:rPr>
-              <w:t xml:space="preserve"> támogatás</w:t>
+              <w:t xml:space="preserve"> támogatás, rendszeradminisztráció</w:t>
+            </w:r>
+          </w:p>
+          <w:p>
+            <w:pPr>
+              <w:pBdr>
+                <w:bottom w:val="single" w:sz="4" w:space="0" w:color="CCCCCC"/>
+              </w:pBdr>
+              <w:spacing w:before="220" w:after="60"/>
+            </w:pPr>
+            <w:r>
+              <w:rPr>
+                <w:rFonts w:ascii="Calibri" w:eastAsia="Calibri" w:hAnsi="Calibri" w:cs="Calibri"/>
+                <w:b/>
+                <w:bCs/>
+                <w:color w:val="1A1A2E"/>
+                <w:spacing w:val="40"/>
+              </w:rPr>
+              <w:t>KIEMELT PROJEKTEK</w:t>
+            </w:r>
+          </w:p>
+          <w:p>
+            <w:pPr>
+              <w:spacing w:before="160" w:after="20"/>
+            </w:pPr>
+            <w:r>
+              <w:rPr>
+                <w:rFonts w:ascii="Calibri" w:eastAsia="Calibri" w:hAnsi="Calibri" w:cs="Calibri"/>
+                <w:b/>
+                <w:bCs/>
+                <w:color w:val="1A1A2E"/>
+                <w:sz w:val="21"/>
+                <w:szCs w:val="21"/>
+              </w:rPr>
+              <w:t xml:space="preserve">Windows Server </w:t>
+            </w:r>
+            <w:proofErr w:type="spellStart"/>
+            <w:r>
+              <w:rPr>
+                <w:rFonts w:ascii="Calibri" w:eastAsia="Calibri" w:hAnsi="Calibri" w:cs="Calibri"/>
+                <w:b/>
+                <w:bCs/>
+                <w:color w:val="1A1A2E"/>
+                <w:sz w:val="21"/>
+                <w:szCs w:val="21"/>
+              </w:rPr>
+              <w:t>Homelab</w:t>
+            </w:r>
+            <w:proofErr w:type="spellEnd"/>
+          </w:p>
+          <w:p>
+            <w:pPr>
+              <w:spacing w:after="60"/>
+            </w:pPr>
+            <w:r>
+              <w:rPr>
+                <w:rFonts w:ascii="Calibri" w:eastAsia="Calibri" w:hAnsi="Calibri" w:cs="Calibri"/>
+                <w:i/>
+                <w:iCs/>
+                <w:color w:val="888888"/>
+                <w:sz w:val="18"/>
+                <w:szCs w:val="18"/>
+              </w:rPr>
+              <w:t xml:space="preserve">Windows Server 2022 · </w:t>
+            </w:r>
+            <w:proofErr w:type="spellStart"/>
+            <w:r>
+              <w:rPr>
+                <w:rFonts w:ascii="Calibri" w:eastAsia="Calibri" w:hAnsi="Calibri" w:cs="Calibri"/>
+                <w:i/>
+                <w:iCs/>
+                <w:color w:val="888888"/>
+                <w:sz w:val="18"/>
+                <w:szCs w:val="18"/>
+              </w:rPr>
+              <w:t>IIS</w:t>
+            </w:r>
+            <w:proofErr w:type="spellEnd"/>
+            <w:r>
+              <w:rPr>
+                <w:rFonts w:ascii="Calibri" w:eastAsia="Calibri" w:hAnsi="Calibri" w:cs="Calibri"/>
+                <w:i/>
+                <w:iCs/>
+                <w:color w:val="888888"/>
+                <w:sz w:val="18"/>
+                <w:szCs w:val="18"/>
+              </w:rPr>
+              <w:t xml:space="preserve"> · Docker · </w:t>
+            </w:r>
+            <w:proofErr w:type="spellStart"/>
+            <w:r>
+              <w:rPr>
+                <w:rFonts w:ascii="Calibri" w:eastAsia="Calibri" w:hAnsi="Calibri" w:cs="Calibri"/>
+                <w:i/>
+                <w:iCs/>
+                <w:color w:val="888888"/>
+                <w:sz w:val="18"/>
+                <w:szCs w:val="18"/>
+              </w:rPr>
+              <w:t>Tailscale</w:t>
+            </w:r>
+            <w:proofErr w:type="spellEnd"/>
+            <w:r>
+              <w:rPr>
+                <w:rFonts w:ascii="Calibri" w:eastAsia="Calibri" w:hAnsi="Calibri" w:cs="Calibri"/>
+                <w:i/>
+                <w:iCs/>
+                <w:color w:val="888888"/>
+                <w:sz w:val="18"/>
+                <w:szCs w:val="18"/>
+              </w:rPr>
+              <w:t xml:space="preserve"> · SQL Server</w:t>
+            </w:r>
+          </w:p>
+          <w:p>
+            <w:pPr>
+              <w:spacing w:after="140"/>
+            </w:pPr>
+            <w:r>
+              <w:rPr>
+                <w:rFonts w:ascii="Calibri" w:eastAsia="Calibri" w:hAnsi="Calibri" w:cs="Calibri"/>
+                <w:color w:val="555555"/>
+                <w:sz w:val="18"/>
+                <w:szCs w:val="18"/>
+              </w:rPr>
+              <w:t xml:space="preserve">Saját infrastruktúra több párhuzamosan futó </w:t>
+            </w:r>
+            <w:proofErr w:type="spellStart"/>
+            <w:r>
+              <w:rPr>
+                <w:rFonts w:ascii="Calibri" w:eastAsia="Calibri" w:hAnsi="Calibri" w:cs="Calibri"/>
+                <w:color w:val="555555"/>
+                <w:sz w:val="18"/>
+                <w:szCs w:val="18"/>
+              </w:rPr>
+              <w:t>ASP.NET</w:t>
+            </w:r>
+            <w:proofErr w:type="spellEnd"/>
+            <w:r>
+              <w:rPr>
+                <w:rFonts w:ascii="Calibri" w:eastAsia="Calibri" w:hAnsi="Calibri" w:cs="Calibri"/>
+                <w:color w:val="555555"/>
+                <w:sz w:val="18"/>
+                <w:szCs w:val="18"/>
+              </w:rPr>
+              <w:t xml:space="preserve"> </w:t>
+            </w:r>
+            <w:proofErr w:type="spellStart"/>
+            <w:r>
+              <w:rPr>
+                <w:rFonts w:ascii="Calibri" w:eastAsia="Calibri" w:hAnsi="Calibri" w:cs="Calibri"/>
+                <w:color w:val="555555"/>
+                <w:sz w:val="18"/>
+                <w:szCs w:val="18"/>
+              </w:rPr>
+              <w:t>Core</w:t>
+            </w:r>
+            <w:proofErr w:type="spellEnd"/>
+            <w:r>
+              <w:rPr>
+                <w:rFonts w:ascii="Calibri" w:eastAsia="Calibri" w:hAnsi="Calibri" w:cs="Calibri"/>
+                <w:color w:val="555555"/>
+                <w:sz w:val="18"/>
+                <w:szCs w:val="18"/>
+              </w:rPr>
+              <w:t xml:space="preserve"> alkalmazással: </w:t>
+            </w:r>
+            <w:proofErr w:type="spellStart"/>
+            <w:r>
+              <w:rPr>
+                <w:rFonts w:ascii="Calibri" w:eastAsia="Calibri" w:hAnsi="Calibri" w:cs="Calibri"/>
+                <w:color w:val="555555"/>
+                <w:sz w:val="18"/>
+                <w:szCs w:val="18"/>
+              </w:rPr>
+              <w:t>MailHub</w:t>
+            </w:r>
+            <w:proofErr w:type="spellEnd"/>
+            <w:r>
+              <w:rPr>
+                <w:rFonts w:ascii="Calibri" w:eastAsia="Calibri" w:hAnsi="Calibri" w:cs="Calibri"/>
+                <w:color w:val="555555"/>
+                <w:sz w:val="18"/>
+                <w:szCs w:val="18"/>
+              </w:rPr>
+              <w:t xml:space="preserve"> (értesítési </w:t>
+            </w:r>
+            <w:proofErr w:type="spellStart"/>
+            <w:r>
+              <w:rPr>
+                <w:rFonts w:ascii="Calibri" w:eastAsia="Calibri" w:hAnsi="Calibri" w:cs="Calibri"/>
+                <w:color w:val="555555"/>
+                <w:sz w:val="18"/>
+                <w:szCs w:val="18"/>
+              </w:rPr>
+              <w:t>hub</w:t>
+            </w:r>
+            <w:proofErr w:type="spellEnd"/>
+            <w:r>
+              <w:rPr>
+                <w:rFonts w:ascii="Calibri" w:eastAsia="Calibri" w:hAnsi="Calibri" w:cs="Calibri"/>
+                <w:color w:val="555555"/>
+                <w:sz w:val="18"/>
+                <w:szCs w:val="18"/>
+              </w:rPr>
+              <w:t xml:space="preserve">), </w:t>
+            </w:r>
+            <w:proofErr w:type="spellStart"/>
+            <w:r>
+              <w:rPr>
+                <w:rFonts w:ascii="Calibri" w:eastAsia="Calibri" w:hAnsi="Calibri" w:cs="Calibri"/>
+                <w:color w:val="555555"/>
+                <w:sz w:val="18"/>
+                <w:szCs w:val="18"/>
+              </w:rPr>
+              <w:t>ShellRunner</w:t>
+            </w:r>
+            <w:proofErr w:type="spellEnd"/>
+            <w:r>
+              <w:rPr>
+                <w:rFonts w:ascii="Calibri" w:eastAsia="Calibri" w:hAnsi="Calibri" w:cs="Calibri"/>
+                <w:color w:val="555555"/>
+                <w:sz w:val="18"/>
+                <w:szCs w:val="18"/>
+              </w:rPr>
+              <w:t xml:space="preserve"> (távoli PowerShell), </w:t>
+            </w:r>
+            <w:proofErr w:type="spellStart"/>
+            <w:r>
+              <w:rPr>
+                <w:rFonts w:ascii="Calibri" w:eastAsia="Calibri" w:hAnsi="Calibri" w:cs="Calibri"/>
+                <w:color w:val="555555"/>
+                <w:sz w:val="18"/>
+                <w:szCs w:val="18"/>
+              </w:rPr>
+              <w:t>NetMapper</w:t>
+            </w:r>
+            <w:proofErr w:type="spellEnd"/>
+            <w:r>
+              <w:rPr>
+                <w:rFonts w:ascii="Calibri" w:eastAsia="Calibri" w:hAnsi="Calibri" w:cs="Calibri"/>
+                <w:color w:val="555555"/>
+                <w:sz w:val="18"/>
+                <w:szCs w:val="18"/>
+              </w:rPr>
+              <w:t xml:space="preserve"> és más belső eszközök.</w:t>
+            </w:r>
+          </w:p>
+          <w:p>
+            <w:pPr>
+              <w:spacing w:before="160" w:after="20"/>
+            </w:pPr>
+            <w:proofErr w:type="spellStart"/>
+            <w:r>
+              <w:rPr>
+                <w:rFonts w:ascii="Calibri" w:eastAsia="Calibri" w:hAnsi="Calibri" w:cs="Calibri"/>
+                <w:b/>
+                <w:bCs/>
+                <w:color w:val="1A1A2E"/>
+                <w:sz w:val="21"/>
+                <w:szCs w:val="21"/>
+              </w:rPr>
+              <w:t>HomeGit</w:t>
+            </w:r>
+            <w:proofErr w:type="spellEnd"/>
+          </w:p>
+          <w:p>
+            <w:pPr>
+              <w:spacing w:after="60"/>
+            </w:pPr>
+            <w:proofErr w:type="spellStart"/>
+            <w:r>
+              <w:rPr>
+                <w:rFonts w:ascii="Calibri" w:eastAsia="Calibri" w:hAnsi="Calibri" w:cs="Calibri"/>
+                <w:i/>
+                <w:iCs/>
+                <w:color w:val="888888"/>
+                <w:sz w:val="18"/>
+                <w:szCs w:val="18"/>
+              </w:rPr>
+              <w:t>ASP.NET</w:t>
+            </w:r>
+            <w:proofErr w:type="spellEnd"/>
+            <w:r>
+              <w:rPr>
+                <w:rFonts w:ascii="Calibri" w:eastAsia="Calibri" w:hAnsi="Calibri" w:cs="Calibri"/>
+                <w:i/>
+                <w:iCs/>
+                <w:color w:val="888888"/>
+                <w:sz w:val="18"/>
+                <w:szCs w:val="18"/>
+              </w:rPr>
+              <w:t xml:space="preserve"> </w:t>
+            </w:r>
+            <w:proofErr w:type="spellStart"/>
+            <w:r>
+              <w:rPr>
+                <w:rFonts w:ascii="Calibri" w:eastAsia="Calibri" w:hAnsi="Calibri" w:cs="Calibri"/>
+                <w:i/>
+                <w:iCs/>
+                <w:color w:val="888888"/>
+                <w:sz w:val="18"/>
+                <w:szCs w:val="18"/>
+              </w:rPr>
+              <w:t>Core</w:t>
+            </w:r>
+            <w:proofErr w:type="spellEnd"/>
+            <w:r>
+              <w:rPr>
+                <w:rFonts w:ascii="Calibri" w:eastAsia="Calibri" w:hAnsi="Calibri" w:cs="Calibri"/>
+                <w:i/>
+                <w:iCs/>
+                <w:color w:val="888888"/>
+                <w:sz w:val="18"/>
+                <w:szCs w:val="18"/>
+              </w:rPr>
+              <w:t xml:space="preserve"> · </w:t>
+            </w:r>
+            <w:proofErr w:type="spellStart"/>
+            <w:r>
+              <w:rPr>
+                <w:rFonts w:ascii="Calibri" w:eastAsia="Calibri" w:hAnsi="Calibri" w:cs="Calibri"/>
+                <w:i/>
+                <w:iCs/>
+                <w:color w:val="888888"/>
+                <w:sz w:val="18"/>
+                <w:szCs w:val="18"/>
+              </w:rPr>
+              <w:t>Razor</w:t>
+            </w:r>
+            <w:proofErr w:type="spellEnd"/>
+            <w:r>
+              <w:rPr>
+                <w:rFonts w:ascii="Calibri" w:eastAsia="Calibri" w:hAnsi="Calibri" w:cs="Calibri"/>
+                <w:i/>
+                <w:iCs/>
+                <w:color w:val="888888"/>
+                <w:sz w:val="18"/>
+                <w:szCs w:val="18"/>
+              </w:rPr>
+              <w:t xml:space="preserve"> </w:t>
+            </w:r>
+            <w:proofErr w:type="spellStart"/>
+            <w:r>
+              <w:rPr>
+                <w:rFonts w:ascii="Calibri" w:eastAsia="Calibri" w:hAnsi="Calibri" w:cs="Calibri"/>
+                <w:i/>
+                <w:iCs/>
+                <w:color w:val="888888"/>
+                <w:sz w:val="18"/>
+                <w:szCs w:val="18"/>
+              </w:rPr>
+              <w:t>Pages</w:t>
+            </w:r>
+            <w:proofErr w:type="spellEnd"/>
+            <w:r>
+              <w:rPr>
+                <w:rFonts w:ascii="Calibri" w:eastAsia="Calibri" w:hAnsi="Calibri" w:cs="Calibri"/>
+                <w:i/>
+                <w:iCs/>
+                <w:color w:val="888888"/>
+                <w:sz w:val="18"/>
+                <w:szCs w:val="18"/>
+              </w:rPr>
+              <w:t xml:space="preserve"> · </w:t>
+            </w:r>
+            <w:proofErr w:type="spellStart"/>
+            <w:r>
+              <w:rPr>
+                <w:rFonts w:ascii="Calibri" w:eastAsia="Calibri" w:hAnsi="Calibri" w:cs="Calibri"/>
+                <w:i/>
+                <w:iCs/>
+                <w:color w:val="888888"/>
+                <w:sz w:val="18"/>
+                <w:szCs w:val="18"/>
+              </w:rPr>
+              <w:t>LibGit2Sharp</w:t>
+            </w:r>
+            <w:proofErr w:type="spellEnd"/>
+          </w:p>
+          <w:p>
+            <w:pPr>
+              <w:spacing w:after="140"/>
+            </w:pPr>
+            <w:r>
+              <w:rPr>
+                <w:rFonts w:ascii="Calibri" w:eastAsia="Calibri" w:hAnsi="Calibri" w:cs="Calibri"/>
+                <w:color w:val="555555"/>
+                <w:sz w:val="18"/>
+                <w:szCs w:val="18"/>
+              </w:rPr>
+              <w:t xml:space="preserve">Saját </w:t>
+            </w:r>
+            <w:proofErr w:type="spellStart"/>
+            <w:r>
+              <w:rPr>
+                <w:rFonts w:ascii="Calibri" w:eastAsia="Calibri" w:hAnsi="Calibri" w:cs="Calibri"/>
+                <w:color w:val="555555"/>
+                <w:sz w:val="18"/>
+                <w:szCs w:val="18"/>
+              </w:rPr>
+              <w:t>Git</w:t>
+            </w:r>
+            <w:proofErr w:type="spellEnd"/>
+            <w:r>
+              <w:rPr>
+                <w:rFonts w:ascii="Calibri" w:eastAsia="Calibri" w:hAnsi="Calibri" w:cs="Calibri"/>
+                <w:color w:val="555555"/>
+                <w:sz w:val="18"/>
+                <w:szCs w:val="18"/>
+              </w:rPr>
+              <w:t xml:space="preserve"> </w:t>
+            </w:r>
+            <w:proofErr w:type="spellStart"/>
+            <w:r>
+              <w:rPr>
+                <w:rFonts w:ascii="Calibri" w:eastAsia="Calibri" w:hAnsi="Calibri" w:cs="Calibri"/>
+                <w:color w:val="555555"/>
+                <w:sz w:val="18"/>
+                <w:szCs w:val="18"/>
+              </w:rPr>
+              <w:t>repository</w:t>
+            </w:r>
+            <w:proofErr w:type="spellEnd"/>
+            <w:r>
+              <w:rPr>
+                <w:rFonts w:ascii="Calibri" w:eastAsia="Calibri" w:hAnsi="Calibri" w:cs="Calibri"/>
+                <w:color w:val="555555"/>
+                <w:sz w:val="18"/>
+                <w:szCs w:val="18"/>
+              </w:rPr>
+              <w:t xml:space="preserve"> menedzsment rendszer helyi </w:t>
+            </w:r>
+            <w:proofErr w:type="spellStart"/>
+            <w:r>
+              <w:rPr>
+                <w:rFonts w:ascii="Calibri" w:eastAsia="Calibri" w:hAnsi="Calibri" w:cs="Calibri"/>
+                <w:color w:val="555555"/>
+                <w:sz w:val="18"/>
+                <w:szCs w:val="18"/>
+              </w:rPr>
+              <w:t>repók</w:t>
+            </w:r>
+            <w:proofErr w:type="spellEnd"/>
+            <w:r>
+              <w:rPr>
+                <w:rFonts w:ascii="Calibri" w:eastAsia="Calibri" w:hAnsi="Calibri" w:cs="Calibri"/>
+                <w:color w:val="555555"/>
+                <w:sz w:val="18"/>
+                <w:szCs w:val="18"/>
+              </w:rPr>
+              <w:t xml:space="preserve"> webes kezeléséhez. </w:t>
+            </w:r>
+            <w:proofErr w:type="spellStart"/>
+            <w:r>
+              <w:rPr>
+                <w:rFonts w:ascii="Calibri" w:eastAsia="Calibri" w:hAnsi="Calibri" w:cs="Calibri"/>
+                <w:color w:val="555555"/>
+                <w:sz w:val="18"/>
+                <w:szCs w:val="18"/>
+              </w:rPr>
+              <w:t>Branch</w:t>
+            </w:r>
+            <w:proofErr w:type="spellEnd"/>
+            <w:r>
+              <w:rPr>
+                <w:rFonts w:ascii="Calibri" w:eastAsia="Calibri" w:hAnsi="Calibri" w:cs="Calibri"/>
+                <w:color w:val="555555"/>
+                <w:sz w:val="18"/>
+                <w:szCs w:val="18"/>
+              </w:rPr>
+              <w:t xml:space="preserve">-, </w:t>
+            </w:r>
+            <w:proofErr w:type="spellStart"/>
+            <w:r>
+              <w:rPr>
+                <w:rFonts w:ascii="Calibri" w:eastAsia="Calibri" w:hAnsi="Calibri" w:cs="Calibri"/>
+                <w:color w:val="555555"/>
+                <w:sz w:val="18"/>
+                <w:szCs w:val="18"/>
+              </w:rPr>
+              <w:t>commit</w:t>
+            </w:r>
+            <w:proofErr w:type="spellEnd"/>
+            <w:r>
+              <w:rPr>
+                <w:rFonts w:ascii="Calibri" w:eastAsia="Calibri" w:hAnsi="Calibri" w:cs="Calibri"/>
+                <w:color w:val="555555"/>
+                <w:sz w:val="18"/>
+                <w:szCs w:val="18"/>
+              </w:rPr>
+              <w:t xml:space="preserve">-, státusz- és klónozás-műveletek támogatása központi felületről, a </w:t>
+            </w:r>
+            <w:proofErr w:type="spellStart"/>
+            <w:r>
+              <w:rPr>
+                <w:rFonts w:ascii="Calibri" w:eastAsia="Calibri" w:hAnsi="Calibri" w:cs="Calibri"/>
+                <w:color w:val="555555"/>
+                <w:sz w:val="18"/>
+                <w:szCs w:val="18"/>
+              </w:rPr>
+              <w:t>homelab</w:t>
+            </w:r>
+            <w:proofErr w:type="spellEnd"/>
+            <w:r>
+              <w:rPr>
+                <w:rFonts w:ascii="Calibri" w:eastAsia="Calibri" w:hAnsi="Calibri" w:cs="Calibri"/>
+                <w:color w:val="555555"/>
+                <w:sz w:val="18"/>
+                <w:szCs w:val="18"/>
+              </w:rPr>
+              <w:t xml:space="preserve"> infrastruktúra részeként.</w:t>
             </w:r>
           </w:p>
           <w:p>
@@ -1404,10 +2230,64 @@
 <file path=word/numbering.xml><?xml version="1.0" encoding="utf-8"?>
 <w:numbering xmlns:wpc="http://schemas.microsoft.com/office/word/2010/wordprocessingCanvas" xmlns:cx="http://schemas.microsoft.com/office/drawing/2014/chartex" xmlns:cx1="http://schemas.microsoft.com/office/drawing/2015/9/8/chartex" xmlns:cx2="http://schemas.microsoft.com/office/drawing/2015/10/21/chartex" xmlns:cx3="http://schemas.microsoft.com/office/drawing/2016/5/9/chartex" xmlns:cx4="http://schemas.microsoft.com/office/drawing/2016/5/10/chartex" xmlns:cx5="http://schemas.microsoft.com/office/drawing/2016/5/11/chartex" xmlns:cx6="http://schemas.microsoft.com/office/drawing/2016/5/12/chartex" xmlns:cx7="http://schemas.microsoft.com/office/drawing/2016/5/13/chartex" xmlns:cx8="http://schemas.microsoft.com/office/drawing/2016/5/14/chartex" xmlns:mc="http://schemas.openxmlformats.org/markup-compatibility/2006" xmlns:aink="http://schemas.microsoft.com/office/drawing/2016/ink" xmlns:am3d="http://schemas.microsoft.com/office/drawing/2017/model3d" xmlns:o="urn:schemas-microsoft-com:office:office" xmlns:oel="http://schemas.microsoft.com/office/2019/extlst" xmlns:r="http://schemas.openxmlformats.org/officeDocument/2006/relationships" xmlns:m="http://schemas.openxmlformats.org/officeDocument/2006/math" xmlns:v="urn:schemas-microsoft-com:vml" xmlns:wp14="http://schemas.microsoft.com/office/word/2010/wordprocessingDrawing" xmlns:wp="http://schemas.openxmlformats.org/drawingml/2006/wordprocessingDrawing" xmlns:w10="urn:schemas-microsoft-com:office:word" xmlns:w="http://schemas.openxmlformats.org/wordprocessingml/2006/main" xmlns:w14="http://schemas.microsoft.com/office/word/2010/wordml" xmlns:w15="http://schemas.microsoft.com/office/word/2012/wordml" xmlns:w16cex="http://schemas.microsoft.com/office/word/2018/wordml/cex" xmlns:w16cid="http://schemas.microsoft.com/office/word/2016/wordml/cid" xmlns:w16="http://schemas.microsoft.com/office/word/2018/wordml" xmlns:w16du="http://schemas.microsoft.com/office/word/2023/wordml/word16du" xmlns:w16sdtdh="http://schemas.microsoft.com/office/word/2020/wordml/sdtdatahash" xmlns:w16sdtfl="http://schemas.microsoft.com/office/word/2024/wordml/sdtformatlock" xmlns:w16se="http://schemas.microsoft.com/office/word/2015/wordml/symex" xmlns:wpg="http://schemas.microsoft.com/office/word/2010/wordprocessingGroup" xmlns:wpi="http://schemas.microsoft.com/office/word/2010/wordprocessingInk" xmlns:wne="http://schemas.microsoft.com/office/word/2006/wordml" xmlns:wps="http://schemas.microsoft.com/office/word/2010/wordprocessingShape" mc:Ignorable="w14 w15 w16se w16cid w16 w16cex w16sdtdh w16sdtfl w16du wp14">
   <w:abstractNum w:abstractNumId="0" w15:restartNumberingAfterBreak="0">
-    <w:nsid w:val="43C21BA8"/>
+    <w:nsid w:val="12D245E9"/>
     <w:multiLevelType w:val="hybridMultilevel"/>
-    <w:tmpl w:val="5D62CB28"/>
-    <w:lvl w:ilvl="0" w:tplc="650A9F40">
+    <w:tmpl w:val="8A02DBD4"/>
+    <w:lvl w:ilvl="0" w:tplc="E640DA8E">
+      <w:start w:val="1"/>
+      <w:numFmt w:val="bullet"/>
+      <w:lvlText w:val="–"/>
+      <w:lvlJc w:val="left"/>
+      <w:pPr>
+        <w:ind w:left="360" w:hanging="360"/>
+      </w:pPr>
+    </w:lvl>
+    <w:lvl w:ilvl="1" w:tplc="16669B98">
+      <w:numFmt w:val="decimal"/>
+      <w:lvlText w:val=""/>
+      <w:lvlJc w:val="left"/>
+    </w:lvl>
+    <w:lvl w:ilvl="2" w:tplc="C0C4B664">
+      <w:numFmt w:val="decimal"/>
+      <w:lvlText w:val=""/>
+      <w:lvlJc w:val="left"/>
+    </w:lvl>
+    <w:lvl w:ilvl="3" w:tplc="9126CB9C">
+      <w:numFmt w:val="decimal"/>
+      <w:lvlText w:val=""/>
+      <w:lvlJc w:val="left"/>
+    </w:lvl>
+    <w:lvl w:ilvl="4" w:tplc="BE4273F0">
+      <w:numFmt w:val="decimal"/>
+      <w:lvlText w:val=""/>
+      <w:lvlJc w:val="left"/>
+    </w:lvl>
+    <w:lvl w:ilvl="5" w:tplc="4BBE2C66">
+      <w:numFmt w:val="decimal"/>
+      <w:lvlText w:val=""/>
+      <w:lvlJc w:val="left"/>
+    </w:lvl>
+    <w:lvl w:ilvl="6" w:tplc="CB58A3AA">
+      <w:numFmt w:val="decimal"/>
+      <w:lvlText w:val=""/>
+      <w:lvlJc w:val="left"/>
+    </w:lvl>
+    <w:lvl w:ilvl="7" w:tplc="5BC860A0">
+      <w:numFmt w:val="decimal"/>
+      <w:lvlText w:val=""/>
+      <w:lvlJc w:val="left"/>
+    </w:lvl>
+    <w:lvl w:ilvl="8" w:tplc="46824794">
+      <w:numFmt w:val="decimal"/>
+      <w:lvlText w:val=""/>
+      <w:lvlJc w:val="left"/>
+    </w:lvl>
+  </w:abstractNum>
+  <w:abstractNum w:abstractNumId="1" w15:restartNumberingAfterBreak="0">
+    <w:nsid w:val="7B5E122C"/>
+    <w:multiLevelType w:val="hybridMultilevel"/>
+    <w:tmpl w:val="19900020"/>
+    <w:lvl w:ilvl="0" w:tplc="211EDB5E">
       <w:start w:val="1"/>
       <w:numFmt w:val="bullet"/>
       <w:lvlText w:val="●"/>
@@ -1416,7 +2296,7 @@
         <w:ind w:left="720" w:hanging="360"/>
       </w:pPr>
     </w:lvl>
-    <w:lvl w:ilvl="1" w:tplc="E9FCFE42">
+    <w:lvl w:ilvl="1" w:tplc="322C2D12">
       <w:start w:val="1"/>
       <w:numFmt w:val="bullet"/>
       <w:lvlText w:val="○"/>
@@ -1425,7 +2305,7 @@
         <w:ind w:left="1440" w:hanging="360"/>
       </w:pPr>
     </w:lvl>
-    <w:lvl w:ilvl="2" w:tplc="BF6AC762">
+    <w:lvl w:ilvl="2" w:tplc="523C2746">
       <w:start w:val="1"/>
       <w:numFmt w:val="bullet"/>
       <w:lvlText w:val="■"/>
@@ -1434,7 +2314,7 @@
         <w:ind w:left="2160" w:hanging="360"/>
       </w:pPr>
     </w:lvl>
-    <w:lvl w:ilvl="3" w:tplc="9752B140">
+    <w:lvl w:ilvl="3" w:tplc="F502CF76">
       <w:start w:val="1"/>
       <w:numFmt w:val="bullet"/>
       <w:lvlText w:val="●"/>
@@ -1443,7 +2323,7 @@
         <w:ind w:left="2880" w:hanging="360"/>
       </w:pPr>
     </w:lvl>
-    <w:lvl w:ilvl="4" w:tplc="94D641F2">
+    <w:lvl w:ilvl="4" w:tplc="928C874A">
       <w:start w:val="1"/>
       <w:numFmt w:val="bullet"/>
       <w:lvlText w:val="○"/>
@@ -1452,7 +2332,7 @@
         <w:ind w:left="3600" w:hanging="360"/>
       </w:pPr>
     </w:lvl>
-    <w:lvl w:ilvl="5" w:tplc="5978A192">
+    <w:lvl w:ilvl="5" w:tplc="A6F0ED64">
       <w:start w:val="1"/>
       <w:numFmt w:val="bullet"/>
       <w:lvlText w:val="■"/>
@@ -1461,7 +2341,7 @@
         <w:ind w:left="4320" w:hanging="360"/>
       </w:pPr>
     </w:lvl>
-    <w:lvl w:ilvl="6" w:tplc="E5FE051E">
+    <w:lvl w:ilvl="6" w:tplc="DC36B21A">
       <w:start w:val="1"/>
       <w:numFmt w:val="bullet"/>
       <w:lvlText w:val="●"/>
@@ -1470,7 +2350,7 @@
         <w:ind w:left="5040" w:hanging="360"/>
       </w:pPr>
     </w:lvl>
-    <w:lvl w:ilvl="7" w:tplc="9CBC3DDC">
+    <w:lvl w:ilvl="7" w:tplc="2632AE8A">
       <w:start w:val="1"/>
       <w:numFmt w:val="bullet"/>
       <w:lvlText w:val="●"/>
@@ -1479,7 +2359,7 @@
         <w:ind w:left="5760" w:hanging="360"/>
       </w:pPr>
     </w:lvl>
-    <w:lvl w:ilvl="8" w:tplc="88CC595E">
+    <w:lvl w:ilvl="8" w:tplc="59D00A72">
       <w:start w:val="1"/>
       <w:numFmt w:val="bullet"/>
       <w:lvlText w:val="●"/>
@@ -1489,68 +2369,14 @@
       </w:pPr>
     </w:lvl>
   </w:abstractNum>
-  <w:abstractNum w:abstractNumId="1" w15:restartNumberingAfterBreak="0">
-    <w:nsid w:val="7C0467AF"/>
-    <w:multiLevelType w:val="hybridMultilevel"/>
-    <w:tmpl w:val="FBB88456"/>
-    <w:lvl w:ilvl="0" w:tplc="655ACD10">
-      <w:start w:val="1"/>
-      <w:numFmt w:val="bullet"/>
-      <w:lvlText w:val="–"/>
-      <w:lvlJc w:val="left"/>
-      <w:pPr>
-        <w:ind w:left="360" w:hanging="360"/>
-      </w:pPr>
-    </w:lvl>
-    <w:lvl w:ilvl="1" w:tplc="5A8AC514">
-      <w:numFmt w:val="decimal"/>
-      <w:lvlText w:val=""/>
-      <w:lvlJc w:val="left"/>
-    </w:lvl>
-    <w:lvl w:ilvl="2" w:tplc="25662C28">
-      <w:numFmt w:val="decimal"/>
-      <w:lvlText w:val=""/>
-      <w:lvlJc w:val="left"/>
-    </w:lvl>
-    <w:lvl w:ilvl="3" w:tplc="6AA23B7C">
-      <w:numFmt w:val="decimal"/>
-      <w:lvlText w:val=""/>
-      <w:lvlJc w:val="left"/>
-    </w:lvl>
-    <w:lvl w:ilvl="4" w:tplc="70C2584A">
-      <w:numFmt w:val="decimal"/>
-      <w:lvlText w:val=""/>
-      <w:lvlJc w:val="left"/>
-    </w:lvl>
-    <w:lvl w:ilvl="5" w:tplc="7EB67D56">
-      <w:numFmt w:val="decimal"/>
-      <w:lvlText w:val=""/>
-      <w:lvlJc w:val="left"/>
-    </w:lvl>
-    <w:lvl w:ilvl="6" w:tplc="B47A4294">
-      <w:numFmt w:val="decimal"/>
-      <w:lvlText w:val=""/>
-      <w:lvlJc w:val="left"/>
-    </w:lvl>
-    <w:lvl w:ilvl="7" w:tplc="BCD24B0E">
-      <w:numFmt w:val="decimal"/>
-      <w:lvlText w:val=""/>
-      <w:lvlJc w:val="left"/>
-    </w:lvl>
-    <w:lvl w:ilvl="8" w:tplc="A54A8FCC">
-      <w:numFmt w:val="decimal"/>
-      <w:lvlText w:val=""/>
-      <w:lvlJc w:val="left"/>
-    </w:lvl>
-  </w:abstractNum>
-  <w:num w:numId="1" w16cid:durableId="1950889904">
-    <w:abstractNumId w:val="0"/>
+  <w:num w:numId="1" w16cid:durableId="1817646542">
+    <w:abstractNumId w:val="1"/>
     <w:lvlOverride w:ilvl="0">
       <w:startOverride w:val="1"/>
     </w:lvlOverride>
   </w:num>
-  <w:num w:numId="2" w16cid:durableId="1130050518">
-    <w:abstractNumId w:val="1"/>
+  <w:num w:numId="2" w16cid:durableId="830407795">
+    <w:abstractNumId w:val="0"/>
     <w:lvlOverride w:ilvl="0">
       <w:startOverride w:val="1"/>
     </w:lvlOverride>

</xml_diff>